<commit_message>
Sincroniza Plan anual, Planes de clase y Muestra con Drive (versión en oficio del 02/10)
Co-Authored-By: Claude Opus 5.5 <noreply@anthropic.com>
Claude-Session: https://claude.ai/code/session_012pzpEV746W2Xyeg29Pf1vY
</commit_message>
<xml_diff>
--- a/Software_1er_Curso/Gabinete_Informatica_Software_1er_Curso_PLAN_ANUAL_COMERCIAL_2026.docx
+++ b/Software_1er_Curso/Gabinete_Informatica_Software_1er_Curso_PLAN_ANUAL_COMERCIAL_2026.docx
@@ -6,7 +6,7 @@
       <w:pPr>
         <w:spacing w:before="0" w:after="0"/>
         <w:sectPr>
-          <w:pgSz w:w="11906" w:h="16838"/>
+          <w:pgSz w:w="12240" w:h="18720"/>
           <w:pgMar w:top="850" w:right="850" w:bottom="850" w:left="850" w:header="720" w:footer="720" w:gutter="0"/>
           <w:cols w:space="720"/>
           <w:docGrid w:linePitch="360"/>
@@ -6518,7 +6518,7 @@
     </w:p>
     <w:sectPr>
       <w:footerReference w:type="default" r:id="rId9"/>
-      <w:pgSz w:w="16838" w:h="11906" w:orient="landscape"/>
+      <w:pgSz w:w="18720" w:h="12240" w:orient="landscape"/>
       <w:pgMar w:top="850" w:right="850" w:bottom="850" w:left="850" w:header="720" w:footer="720" w:gutter="0"/>
       <w:cols w:space="720"/>
       <w:docGrid w:linePitch="360"/>

</xml_diff>